<commit_message>
Ch30 review round 1: wall offered and refused, ridge seen, Daren's confession spoken, folio matches Ch22, Ch23 handover, continuity, trims
Co-Authored-By: Claude Opus 5.5 <noreply@anthropic.com>
</commit_message>
<xml_diff>
--- a/claude-notes/manuscript-v2/30-reckoning-merged.docx
+++ b/claude-notes/manuscript-v2/30-reckoning-merged.docx
@@ -243,7 +243,7 @@
           <w:i w:val="0"/>
           <w:strike w:val="0"/>
         </w:rPr>
-        <w:t>"It's gone," she said. "Under the lake. The ration pumps, all of them." She heard her own voice going on, exact, the way she read a gauge. "Nothing's coming up the main to the rows. Not tonight. Not tomorrow. Rita's tap. The tap at the end of ours."</w:t>
+        <w:t>"It's gone," she said. "Under the lake. The ration pumps, all of them." She heard her own voice going on, exact. "Nothing's coming up the main to the rows. Not tonight. Not tomorrow. Rita's tap. The tap at the end of ours."</w:t>
       </w:r>
     </w:p>
     <w:p>
@@ -283,7 +283,7 @@
           <w:i w:val="0"/>
           <w:strike w:val="0"/>
         </w:rPr>
-        <w:t>The metal hand came up on its own, a beat behind. It settled on top of his.</w:t>
+        <w:t>Her metal hand came up on its own, a beat behind. It settled on top of his.</w:t>
       </w:r>
     </w:p>
     <w:p>
@@ -410,7 +410,7 @@
           <w:i w:val="0"/>
           <w:strike w:val="0"/>
         </w:rPr>
-        <w:t>The same words. Whoever wrote them didn't waste new ones.</w:t>
+        <w:t>The same words. Whoever wrote them didn't waste new ones. He'd kept the first appointment with the folio shut on his knee, and the man across from him had said one thing. This time he'd open it.</w:t>
       </w:r>
     </w:p>
     <w:p>
@@ -430,7 +430,7 @@
           <w:i w:val="0"/>
           <w:strike w:val="0"/>
         </w:rPr>
-        <w:t>The lamps were up. Down at the bottom of the tiers, on the lit glass table, the black king stood where he'd left it, upright, alone, one shoulder of the crown worn smooth. Nobody had moved it. Chanakya didn't move what it hadn't been told to.</w:t>
+        <w:t>The lamps were up. Down at the bottom of the tiers, on the lit glass table, the black king stood where he'd left it, upright, alone, one shoulder of the crown worn smooth. Nobody had moved it.</w:t>
       </w:r>
     </w:p>
     <w:p>
@@ -554,7 +554,7 @@
           <w:i w:val="0"/>
           <w:strike w:val="0"/>
         </w:rPr>
-        <w:t>The grey sleeve didn't look at him. A nick white through one eyebrow, a face like a door nobody had written on. Ravi went past him into the room, and the heel came away, and the door closed with both of them inside.</w:t>
+        <w:t>The grey sleeve didn't look at him. He hadn't the last time either. A nick white through one eyebrow. Ravi went past him into the room, and the heel came away, and the door closed with both of them inside.</w:t>
       </w:r>
     </w:p>
     <w:p>
@@ -640,7 +640,7 @@
           <w:i w:val="0"/>
           <w:strike w:val="0"/>
         </w:rPr>
-        <w:t>"First year. I was auditing cross-house allocations, the dull ones. A Kubera transfer through the Continuity Reserve, for a survey of the archive wing that nobody had asked for, signed with two letters. OG. No registered authority." He opened the sleeve and turned to the third page, to the line he'd underlined in pencil three years ago, gone grey and furred. "That was odd. This was worse. Every Reserve order carries the channel it came in by, in a field the channel never checks and the record keeps anyway. This one came in through the summit seal. The Master of the Reserve's own ring." He put his finger above the line, not on it. "An authority no registry holds, through a door only one man in Kubera can open. I flagged it. It was sealed above my grade within the day." He turned to the back board. A seal slip was pasted there, its wax gone brown. "There's the answer to my objection."</w:t>
+        <w:t>"First year. I was auditing cross-house allocations, the dull ones. A Kubera transfer through the Continuity Reserve, for a survey of the archive wing that nobody had asked for. No requesting officer, only a dash. And at the foot, where a signature goes, two letters. OG. No registered authority." He opened the sleeve and turned to the third page, to the line he'd underlined in pencil three years ago, gone grey and furred. "That was odd. This was worse. Every Reserve order carries the channel it came in by, in a field the channel never checks and the record keeps anyway. This one came in through the summit seal. The Master of the Reserve's own ring." He put his finger above the line, not on it. "An authority no registry holds, through a door only one man in Kubera can open. I flagged the dash. It was sealed above my grade within the day, before I'd thought to read the field beneath it." He turned to the back board. A seal slip was pasted there, its wax gone brown. "There's the answer to my objection."</w:t>
       </w:r>
     </w:p>
     <w:p>
@@ -748,7 +748,7 @@
           <w:i w:val="0"/>
           <w:strike w:val="0"/>
         </w:rPr>
-        <w:t>"Someone who's going to stand up tonight and say so. In front of the people who matter." She didn't look away. "His wrist's bare. He took it off himself."</w:t>
+        <w:t>"Someone who's going to stand up tonight and say so. In front of the people who matter. His wrist's bare. He took it off himself."</w:t>
       </w:r>
     </w:p>
     <w:p>
@@ -882,7 +882,7 @@
           <w:i w:val="0"/>
           <w:strike w:val="0"/>
         </w:rPr>
-        <w:t>"The two letters were in the ledger before I was," Daren said, his bare wrist turned up under the lamp. "I thought they were mine." He looked at the folio, not at the Master. "That paper's older than my wrist. He had taken the band off long before. He never stopped signing with what it had made him. I was the second hand to sign them."</w:t>
+        <w:t>"The two letters were in the ledger before I was," Daren said, his bare wrist turned up under the lamp. "I thought they were mine." He looked at the folio, not at the Master. "That paper's older than my wrist. He had taken the band off long before. He kept its letters, and the seal still knew them. I was the second hand to sign them."</w:t>
       </w:r>
     </w:p>
     <w:p>
@@ -912,7 +912,17 @@
           <w:i w:val="0"/>
           <w:strike w:val="0"/>
         </w:rPr>
-        <w:t>The rest he had already given on the record, in order, standing: the night the band was put on him, and the hand that put it there; the doors; the library money, the Annex, Ashoka's doorways; the fourth-level corridor. He hadn't spared himself anything.</w:t>
+        <w:t>"I bent the library money," he said. "I put nine pages under another man's name. I was afraid in a corridor, and a man who counted things is dead."</w:t>
+      </w:r>
+    </w:p>
+    <w:p>
+      <w:r>
+        <w:rPr>
+          <w:b w:val="0"/>
+          <w:i w:val="0"/>
+          <w:strike w:val="0"/>
+        </w:rPr>
+        <w:t>The rest he had already given on the record, in order, standing: the night the band was put on him, and the hand that put it there; the doors; Ashoka's doorways; the fourth-level corridor. He hadn't spared himself anything.</w:t>
       </w:r>
     </w:p>
     <w:p>
@@ -982,7 +992,27 @@
           <w:i w:val="0"/>
           <w:strike w:val="0"/>
         </w:rPr>
-        <w:t>The Ancient One didn't answer. Elara saw her hands, folded in the shawl, and saw the knuckles of the left one whiten and stay white.</w:t>
+        <w:t>The Ancient One didn't answer the charge. Elara saw her hands, folded in the shawl, and saw the knuckles of the left one whiten and stay white.</w:t>
+      </w:r>
+    </w:p>
+    <w:p>
+      <w:r>
+        <w:rPr>
+          <w:b w:val="0"/>
+          <w:i w:val="0"/>
+          <w:strike w:val="0"/>
+        </w:rPr>
+        <w:t>"The wall is beneath my archive," the Ancient One said. "Any of you may come down and read it."</w:t>
+      </w:r>
+    </w:p>
+    <w:p>
+      <w:r>
+        <w:rPr>
+          <w:b w:val="0"/>
+          <w:i w:val="0"/>
+          <w:strike w:val="0"/>
+        </w:rPr>
+        <w:t>Nobody moved. To read it was to sit where Drona had sat.</w:t>
       </w:r>
     </w:p>
     <w:p>
@@ -1032,7 +1062,7 @@
           <w:i w:val="0"/>
           <w:strike w:val="0"/>
         </w:rPr>
-        <w:t>He put it on. He took the second. He didn't hurry, and he didn't look at the band, and nobody at the table told him to stop.</w:t>
+        <w:t>He put it on. He took the second. The cuff fell back as he reached. Nobody looked at the ridge, and everybody saw it. He didn't hurry, and he didn't look at the band, and nobody at the table told him to stop.</w:t>
       </w:r>
     </w:p>
     <w:p>
@@ -1162,7 +1192,7 @@
           <w:i w:val="0"/>
           <w:strike w:val="0"/>
         </w:rPr>
-        <w:t>Daren stood by the second table with his hands open at his sides and nowhere in the city to put them.</w:t>
+        <w:t>Daren stood by the second table with his hands open at his sides.</w:t>
       </w:r>
     </w:p>
     <w:p>
@@ -1368,7 +1398,7 @@
           <w:i w:val="0"/>
           <w:strike w:val="0"/>
         </w:rPr>
-        <w:t>"Yes. On the wall, more than once. I didn't know whose it was." Elara didn't look away. "I'd have told you the first night if I had."</w:t>
+        <w:t>"Yes. On the wall, more than once. I didn't know whose it was. I'd have told you the first night if I had."</w:t>
       </w:r>
     </w:p>
     <w:p>
@@ -1448,7 +1478,7 @@
           <w:i w:val="0"/>
           <w:strike w:val="0"/>
         </w:rPr>
-        <w:t>Flitzberg brought it down to the workshop wrapped in a cloth, the way someone carries bread.</w:t>
+        <w:t>Flitzberg brought it down to the workshop wrapped in a cloth.</w:t>
       </w:r>
     </w:p>
     <w:p>
@@ -1548,7 +1578,7 @@
           <w:i w:val="0"/>
           <w:strike w:val="0"/>
         </w:rPr>
-        <w:t>"No." He did not look away. "Had I known, you would have heard it from me."</w:t>
+        <w:t>"No." He did not look away. "Had I known, you would have heard it from me." He looked at the band in its cloth. "The wall will watch you take it apart. Let it."</w:t>
       </w:r>
     </w:p>
     <w:p>
@@ -1578,7 +1608,7 @@
           <w:i w:val="0"/>
           <w:strike w:val="0"/>
         </w:rPr>
-        <w:t>Inside, they were the same. She'd known that since the table room, since the moment her arm had heard the band's reach as something it knew. Now she could see it: the same fine web under the skin of each, the same way of listening. Hers ran half a breath behind her and learned her. This one had run a heartbeat ahead of a frightened man and never learned anything. Two halves, and here they lay, a hand's width from each other on a bench with egg yolk dried in the grain.</w:t>
+        <w:t>Inside, they were the same. She'd known that since the table room, since the moment her arm had heard the band's reach as something it knew. Now she could see it: the same fine web under the skin of each, the same way of listening. Hers ran a third of a breath behind her and learned her. This one had run a heartbeat ahead of a frightened man and never learned anything. Two halves, and here they lay, a hand's width from each other on a bench with egg yolk dried in the grain.</w:t>
       </w:r>
     </w:p>
     <w:p>
@@ -1744,7 +1774,7 @@
           <w:i w:val="0"/>
           <w:strike w:val="0"/>
         </w:rPr>
-        <w:t>"Gretchen was there the night it went," Ben said. "At the gates. Late. Same patch. She stood a bit longer than usual. I think she heard the mountain go." His thumb moved on his knee. "Elara took word up this morning, no band on. Gretch heard my name from a Trinity girl in gray-blue." He looked at his hands. "I don't know what she did."</w:t>
+        <w:t>"Gretchen was there the night it went," Ben said. "At the gates. Late. Same patch. She stood a bit longer than usual. I think she heard the mountain go." His thumb moved on his knee. "Elara took word up this morning, bare-wristed. Gretch heard my name from a Trinity girl in gray-blue." He looked at his hands. "I don't know what she did."</w:t>
       </w:r>
     </w:p>
     <w:p>
@@ -1864,7 +1894,7 @@
           <w:i w:val="0"/>
           <w:strike w:val="0"/>
         </w:rPr>
-        <w:t>Flitzberg stood in it. He didn't come in. He was in his own face, his collar open where the marks had been, his hands empty, and he stood on the threshold and looked at the room as a man looks at a sum he's checked many times and needs to check once more.</w:t>
+        <w:t>Flitzberg stood in it. He didn't come in. He was in his own face, his collar open where the marks had been, his hands empty, and he stood on the threshold and looked at the room.</w:t>
       </w:r>
     </w:p>
     <w:p>

</xml_diff>

<commit_message>
Ch30 review round 2: anchor the second sitting, shorter channel proof, shelf above the Hub, trims; Ch29 gray-blue spelling
Co-Authored-By: Claude Opus 5.5 <noreply@anthropic.com>
</commit_message>
<xml_diff>
--- a/claude-notes/manuscript-v2/30-reckoning-merged.docx
+++ b/claude-notes/manuscript-v2/30-reckoning-merged.docx
@@ -213,7 +213,7 @@
           <w:i w:val="0"/>
           <w:strike w:val="0"/>
         </w:rPr>
-        <w:t>"Under. All of it. The galleries, the pods. The straw's broken." The engineer had said so on the line from the Hub, and she'd heard it over Ben's shoulder. "Nobody was down there. Ben counted them off. Every one."</w:t>
+        <w:t>"Under. All of it. The galleries, the pods. The straw's broken." The engineer had said so on the line from the shelf above the Hub, and she'd heard it over Ben's shoulder. "Nobody was down there. Ben counted them off. Every one."</w:t>
       </w:r>
     </w:p>
     <w:p>
@@ -243,7 +243,7 @@
           <w:i w:val="0"/>
           <w:strike w:val="0"/>
         </w:rPr>
-        <w:t>"It's gone," she said. "Under the lake. The ration pumps, all of them." She heard her own voice going on, exact. "Nothing's coming up the main to the rows. Not tonight. Not tomorrow. Rita's tap. The tap at the end of ours."</w:t>
+        <w:t>"It's gone," she said. "Under the lake. The ration pumps, all of them." She heard her own voice going on, exact. "Nothing's coming up the main to the rows. Not tonight. Not tomorrow. Ma's tap. Rita's. The tap at the end of ours."</w:t>
       </w:r>
     </w:p>
     <w:p>
@@ -379,17 +379,17 @@
           <w:i w:val="0"/>
           <w:strike w:val="0"/>
         </w:rPr>
-        <w:t>, and every morning a porter had laid it on his desk, and he'd put each one in the drawer with the others, in order, squared. There was a small stack of them now. He'd stopped counting them, because the counting had started to sound like an excuse.</w:t>
-      </w:r>
-    </w:p>
-    <w:p>
-      <w:r>
-        <w:rPr>
-          <w:b w:val="0"/>
-          <w:i w:val="0"/>
-          <w:strike w:val="0"/>
-        </w:rPr>
-        <w:t>That morning there had been a different slip in his coat, behind the pens, in blunt block letters.</w:t>
+        <w:t>, and every morning a porter had laid it on his desk, and he'd put each one in the drawer with the others, in order, squared. There was a small stack of them now. He'd stopped counting them.</w:t>
+      </w:r>
+    </w:p>
+    <w:p>
+      <w:r>
+        <w:rPr>
+          <w:b w:val="0"/>
+          <w:i w:val="0"/>
+          <w:strike w:val="0"/>
+        </w:rPr>
+        <w:t>That morning there had been a new slip in his coat, behind the pens, in blunt block letters.</w:t>
       </w:r>
     </w:p>
     <w:p>
@@ -640,7 +640,7 @@
           <w:i w:val="0"/>
           <w:strike w:val="0"/>
         </w:rPr>
-        <w:t>"First year. I was auditing cross-house allocations, the dull ones. A Kubera transfer through the Continuity Reserve, for a survey of the archive wing that nobody had asked for. No requesting officer, only a dash. And at the foot, where a signature goes, two letters. OG. No registered authority." He opened the sleeve and turned to the third page, to the line he'd underlined in pencil three years ago, gone grey and furred. "That was odd. This was worse. Every Reserve order carries the channel it came in by, in a field the channel never checks and the record keeps anyway. This one came in through the summit seal. The Master of the Reserve's own ring." He put his finger above the line, not on it. "An authority no registry holds, through a door only one man in Kubera can open. I flagged the dash. It was sealed above my grade within the day, before I'd thought to read the field beneath it." He turned to the back board. A seal slip was pasted there, its wax gone brown. "There's the answer to my objection."</w:t>
+        <w:t>"First year. I was auditing cross-house allocations, the dull ones. A Kubera transfer through the Continuity Reserve, for a survey of the archive wing that nobody had asked for. No requesting officer, only a dash. And at the foot, where a signature goes, two letters. OG. No registered authority." He opened the sleeve and turned to the third page, to the line he'd underlined in pencil three years ago, gone grey and furred. "That was odd. I flagged the dash. It was sealed above my grade within the day, before I'd thought to read the field beneath it." He put his finger above it, not on it. "The channel field said summit seal. The Master's own ring." He turned to the back board. A seal slip was pasted there, its wax gone brown. "There's the answer to my objection."</w:t>
       </w:r>
     </w:p>
     <w:p>
@@ -828,7 +828,7 @@
           <w:i w:val="0"/>
           <w:strike w:val="0"/>
         </w:rPr>
-        <w:t>The round room had a second table in it that night, a plain one, carried in and set beside the first, and Elara had laid the paper road on it herself.</w:t>
+        <w:t>When the table sat again, the next night, the round room had a second table in it, a plain one, carried in and set beside the first, and Elara had laid the paper road on it herself.</w:t>
       </w:r>
     </w:p>
     <w:p>
@@ -1012,7 +1012,7 @@
           <w:i w:val="0"/>
           <w:strike w:val="0"/>
         </w:rPr>
-        <w:t>Nobody moved. To read it was to sit where Drona had sat.</w:t>
+        <w:t>Nobody moved.</w:t>
       </w:r>
     </w:p>
     <w:p>
@@ -1312,7 +1312,7 @@
           <w:i w:val="0"/>
           <w:strike w:val="0"/>
         </w:rPr>
-        <w:t>Rohan's hands were at his sides. The knuckle had split again under its glue, dark. Elara watched them. They didn't close. They didn't open either; they hung, and the fingers held a half-curl, the shape of a hand that had decided against something and was still deciding.</w:t>
+        <w:t>Rohan's hands were at his sides. The knuckle had split again under its glue, dark. Elara watched them. They didn't close. They didn't open either; they hung, and the fingers held a half-curl, and stayed there.</w:t>
       </w:r>
     </w:p>
     <w:p>
@@ -1904,7 +1904,7 @@
           <w:i w:val="0"/>
           <w:strike w:val="0"/>
         </w:rPr>
-        <w:t>His eyes went to Gage first, in the bed with his leg like a hill. Gage looked back at him. Then to Camilla, at the bedside. She looked back. Then to Ben on the end of the bed, with the pencil behind his ear. Ben looked back.</w:t>
+        <w:t>His eyes went to Gage first, in the bed with his leg splinted under the blanket. Gage looked back at him. Then to Camilla, at the bedside. She looked back. Then to Ben on the end of the bed, with the pencil behind his ear. Ben looked back.</w:t>
       </w:r>
     </w:p>
     <w:p>

</xml_diff>